<commit_message>
subiendo para arrancar septiembre
</commit_message>
<xml_diff>
--- a/2026/EL MIRADOR/CERTIFICADOS LIBRE DEUDA/4ºD/CERTIFICADO DEUDA.docx
+++ b/2026/EL MIRADOR/CERTIFICADOS LIBRE DEUDA/4ºD/CERTIFICADO DEUDA.docx
@@ -68,6 +68,12 @@
       </w:r>
     </w:p>
     <w:p>
+      <w:pPr>
+        <w:rPr>
+          <w:b/>
+          <w:bCs/>
+        </w:rPr>
+      </w:pPr>
       <w:r>
         <w:t xml:space="preserve">En mi carácter de administradora del </w:t>
       </w:r>
@@ -157,20 +163,33 @@
           <w:b/>
           <w:bCs/>
         </w:rPr>
-        <w:t>no registra deudas de expensas comunes ni extraordinarias</w:t>
-      </w:r>
-      <w:r>
-        <w:t xml:space="preserve"> al día </w:t>
-      </w:r>
-      <w:r>
-        <w:rPr>
-          <w:b/>
-          <w:bCs/>
-        </w:rPr>
-        <w:t>30 de Agosto del 2026.</w:t>
+        <w:t>n</w:t>
+      </w:r>
+      <w:r>
+        <w:rPr>
+          <w:b/>
+          <w:bCs/>
+        </w:rPr>
+        <w:t>o registra deudas en concepto de expensas comunes al día 09 de septiembre de 2026.</w:t>
       </w:r>
     </w:p>
     <w:p>
+      <w:pPr>
+        <w:rPr>
+          <w:b/>
+          <w:bCs/>
+        </w:rPr>
+      </w:pPr>
+      <w:r>
+        <w:rPr>
+          <w:b/>
+          <w:bCs/>
+        </w:rPr>
+        <w:t>Asimismo, registra deuda correspondiente a la cuota de ARBA Complementario, por la suma de PESOS CIENTO OCHENTA Y SIETE MIL QUINIENTOS NOVENTA Y CINCO CON SEIS CENTAVOS ($187.595,06).</w:t>
+      </w:r>
+    </w:p>
+    <w:p/>
+    <w:p>
       <w:r>
         <w:t xml:space="preserve">Se deja constancia de que las expensas se abonan </w:t>
       </w:r>
@@ -407,6 +426,9 @@
       </w:r>
       <w:r>
         <w:br/>
+      </w:r>
+      <w:r>
+        <w:lastRenderedPageBreak/>
         <w:t>Administradora</w:t>
       </w:r>
       <w:r>
@@ -1035,7 +1057,6 @@
   <w:style w:type="character" w:default="1" w:styleId="Fuentedeprrafopredeter">
     <w:name w:val="Default Paragraph Font"/>
     <w:uiPriority w:val="1"/>
-    <w:semiHidden/>
     <w:unhideWhenUsed/>
   </w:style>
   <w:style w:type="table" w:default="1" w:styleId="Tablanormal">

</xml_diff>